<commit_message>
[fix] scalability handing and implemented outbox pattern
</commit_message>
<xml_diff>
--- a/docs/polen_tracker_propuesta_TFG_v3.docx
+++ b/docs/polen_tracker_propuesta_TFG_v3.docx
@@ -1175,7 +1175,7 @@
     </w:p>
     <w:p>
       <w:r>
-        <w:t>pollen-core crea una recolección con estado PENDING y publica un mensaje collection.requested. El worker lo consume, actualiza conceptualmente el estado a PROCESSING y consulta la fuente indicada. Si el worker no está disponible, RabbitMQ conserva el mensaje hasta que pueda ser atendido.</w:t>
+        <w:t>pollen-core crea una recolección con estado PENDING y guarda en la misma transacción PostgreSQL una entrada PENDING en collection_request_outbox. La petición HTTP no publica directamente en RabbitMQ. Un relay recuperable reclama posteriormente la entrada, publica collection.requested y la marca como PUBLISHED. El worker consume el mensaje y consulta la fuente indicada. Si RabbitMQ o el worker no están disponibles, la solicitud permanece recuperable en el outbox o en la cola, según el punto del flujo en el que se produzca la indisponibilidad.</w:t>
       </w:r>
     </w:p>
     <w:p>
@@ -1468,7 +1468,15 @@
         <w:pStyle w:val="ListBullet"/>
       </w:pPr>
       <w:r>
-        <w:t>Mensajes fallidos: Los mensajes que superen el número máximo de reintentos se dirigirán a una dead-letter queue para revisión y reprocesamiento controlado.</w:t>
+        <w:t>Mensajes fallidos: los listeners realizan tres intentos con backoff exponencial. Cuando se agotan, rechazan el mensaje sin reencolarlo. Las routing keys collection.requests.failed, collection.results.failed y collection.measurements.failed se enlazan de forma exacta desde el exchange directo pollen.dlx hacia la cola pollen.dead-letter.</w:t>
+      </w:r>
+    </w:p>
+    <w:p>
+      <w:pPr>
+        <w:pStyle w:val="ListBullet"/>
+      </w:pPr>
+      <w:r>
+        <w:t>Outbox transaccional: la colección y su solicitud de integración se persistirán atómicamente. El relay reclamará trabajo mediante transacciones cortas, leases y FOR UPDATE SKIP LOCKED, y publicará fuera de la transacción mediante un pool limitado. La entrega será al menos una vez, por lo que los consumidores deberán conservar idempotencia.</w:t>
       </w:r>
     </w:p>
     <w:p>
@@ -2888,7 +2896,7 @@
     </w:p>
     <w:p>
       <w:r>
-        <w:t>Los mensajes publicados y recibidos se registran en rabbit_message_trace con referencia a la recolección. La traza conserva payload, headers, exchange, routing key, cola, identificadores, delivery tag, redelivery y marcas temporales.</w:t>
+        <w:t>Los adaptadores Rabbit registran las solicitudes salientes y los mensajes entrantes procesados en rabbit_message_trace con referencia a la recolección. La traza conserva payload, headers, exchange, routing key, cola, identificadores, delivery tag, redelivery y marcas temporales. Esta tabla es independiente del outbox, que garantiza la publicación recuperable de collection.requested.</w:t>
       </w:r>
     </w:p>
     <w:p>
@@ -2971,18 +2979,58 @@
         <w:pStyle w:val="Heading2"/>
       </w:pPr>
       <w:r>
-        <w:t>12.6. Flujo implementado</w:t>
+        <w:t>12.6. Outbox transaccional, lease y escalado</w:t>
+      </w:r>
+    </w:p>
+    <w:p>
+      <w:pPr/>
+      <w:r>
+        <w:t>El inicio de una recolección utiliza el patrón Transactional Outbox. JpaCollectionSubmissionStore guarda la colección y el contrato CollectionRequest en collection_request_outbox dentro de una única transacción. Si la transacción falla no queda ninguna de las dos filas; si RabbitMQ está temporalmente indisponible, la entrada permanece pendiente y puede publicarse más tarde.</w:t>
+      </w:r>
+    </w:p>
+    <w:p>
+      <w:pPr/>
+      <w:r>
+        <w:t>El relay periódico no mantiene bloqueos de base de datos mientras realiza llamadas de red. En una transacción corta selecciona entradas disponibles mediante FOR UPDATE SKIP LOCKED, cambia su estado de PENDING a PROCESSING y asigna locked_by y locked_until. Tras el commit, entrega las publicaciones a un ThreadPoolTaskExecutor limitado.</w:t>
+      </w:r>
+    </w:p>
+    <w:p>
+      <w:pPr/>
+      <w:r>
+        <w:t>Cada publicación finaliza en una transacción independiente: el éxito cambia la entrada a PUBLISHED; el fallo la devuelve a PENDING, incrementa attempts, conserva last_error y programa available_at con backoff exponencial limitado a 60 segundos. Si una instancia muere, otra puede reclamar las entradas PROCESSING cuyo lease haya vencido.</w:t>
+      </w:r>
+    </w:p>
+    <w:p>
+      <w:pPr/>
+      <w:r>
+        <w:t>FOR UPDATE SKIP LOCKED permite que varias réplicas de pollen-core reclamen lotes diferentes. Dentro de cada réplica, un pool configurable publica varios mensajes en paralelo con capacidad acotada. Los parámetros OUTBOX_BATCH_SIZE, OUTBOX_LEASE, OUTBOX_WORKERS, OUTBOX_QUEUE_CAPACITY y OUTBOX_FIXED_DELAY permiten ajustar el comportamiento sin modificar el código.</w:t>
+      </w:r>
+    </w:p>
+    <w:p>
+      <w:pPr/>
+      <w:r>
+        <w:t>La garantía es at-least-once. Una caída después de que RabbitMQ acepte el mensaje pero antes de confirmar PUBLISHED en PostgreSQL puede causar una publicación duplicada. request_id, event_id y logical_key deben mantener idempotentes a los consumidores.</w:t>
+      </w:r>
+    </w:p>
+    <w:p>
+      <w:pPr>
+        <w:pStyle w:val="Heading2"/>
+      </w:pPr>
+      <w:r>
+        <w:t>12.7. Flujo implementado</w:t>
       </w:r>
     </w:p>
     <w:p>
       <w:r>
-        <w:rPr>
-          <w:rFonts w:ascii="Courier New" w:hAnsi="Courier New"/>
-          <w:sz w:val="21"/>
-        </w:rPr>
         <w:t>POST /api/collections</w:t>
         <w:br/>
-        <w:t xml:space="preserve">  -&gt; collection.requested</w:t>
+        <w:t xml:space="preserve">  -&gt; transacción: collections + collection_request_outbox</w:t>
+        <w:br/>
+        <w:t xml:space="preserve">  -&gt; relay reclama PENDING como PROCESSING mediante lease</w:t>
+        <w:br/>
+        <w:t xml:space="preserve">  -&gt; pool de workers publica collection.requested</w:t>
+        <w:br/>
+        <w:t xml:space="preserve">  -&gt; outbox PUBLISHED</w:t>
         <w:br/>
         <w:t xml:space="preserve">  -&gt; pollen-collector</w:t>
         <w:br/>
@@ -3009,12 +3057,12 @@
         <w:pStyle w:val="Heading2"/>
       </w:pPr>
       <w:r>
-        <w:t>12.7. Estado de verificación</w:t>
+        <w:t>12.8. Estado de verificación</w:t>
       </w:r>
     </w:p>
     <w:p>
       <w:r>
-        <w:t>Los módulos pollen-core y pollen-collector se compilan como imágenes independientes con Java 25 mediante Docker Compose. Flyway gestiona collections, rabbit_message_trace y pollen_measurements.</w:t>
+        <w:t>Los módulos pollen-core y pollen-collector se compilan como imágenes independientes con Java 25 mediante Docker Compose. Flyway gestiona collections, rabbit_message_trace, pollen_measurements y collection_request_outbox. La migración V5 incorpora locked_by y locked_until para los leases. Se ha verificado el arranque, la validación Hibernate, la salud de pollen-core y la publicación real PENDING -&gt; PROCESSING -&gt; PUBLISHED hacia collection.requests.</w:t>
       </w:r>
     </w:p>
     <w:p>

</xml_diff>

<commit_message>
[fix] added log trace and failed worker cases
</commit_message>
<xml_diff>
--- a/docs/polen_tracker_propuesta_TFG_v3.docx
+++ b/docs/polen_tracker_propuesta_TFG_v3.docx
@@ -2997,7 +2997,7 @@
     <w:p>
       <w:pPr/>
       <w:r>
-        <w:t>Cada publicación finaliza en una transacción independiente: el éxito cambia la entrada a PUBLISHED; el fallo la devuelve a PENDING, incrementa attempts, conserva last_error y programa available_at con backoff exponencial limitado a 60 segundos. Si una instancia muere, otra puede reclamar las entradas PROCESSING cuyo lease haya vencido.</w:t>
+        <w:t>Cada publicación finaliza en una transacción independiente: el éxito cambia la entrada a PUBLISHED; el fallo la devuelve a PENDING, incrementa attempts, conserva last_error y programa available_at con backoff exponencial limitado a 60 segundos. Mientras la publicación sigue activa, un heartbeat renueva locked_until cada tercio del lease. Cada reclamación usa un claim_token nuevo y la renovación, finalización y recuperación bloquean la fila de forma pesimista, de modo que un intento antiguo no puede modificar una reclamación posterior.</w:t>
       </w:r>
     </w:p>
     <w:p>
@@ -3062,7 +3062,7 @@
     </w:p>
     <w:p>
       <w:r>
-        <w:t>Los módulos pollen-core y pollen-collector se compilan como imágenes independientes con Java 25 mediante Docker Compose. Flyway gestiona collections, rabbit_message_trace, pollen_measurements y collection_request_outbox. La migración V5 incorpora locked_by y locked_until para los leases. Se ha verificado el arranque, la validación Hibernate, la salud de pollen-core y la publicación real PENDING -&gt; PROCESSING -&gt; PUBLISHED hacia collection.requests.</w:t>
+        <w:t>Los módulos pollen-core y pollen-collector se compilan como imágenes independientes con Java 25 mediante Docker Compose. Flyway gestiona collections, rabbit_message_trace, pollen_measurements y collection_request_outbox. Las migraciones V5 y V6 incorporan leases, claim_token y restricciones de coherencia. Se han verificado la compilación, la validación Hibernate, la salud de pollen-core y la publicación recuperable hacia collection.requests.</w:t>
       </w:r>
     </w:p>
     <w:p>
@@ -3072,6 +3072,29 @@
           <w:sz w:val="21"/>
         </w:rPr>
         <w:t>docker compose build pollen-core pollen-collector</w:t>
+      </w:r>
+    </w:p>
+    <w:p>
+      <w:pPr>
+        <w:pStyle w:val="Heading2"/>
+      </w:pPr>
+      <w:r>
+        <w:t>12.9. Logging y correlación operativa</w:t>
+      </w:r>
+    </w:p>
+    <w:p>
+      <w:r>
+        <w:t>Ambas aplicaciones utilizan una configuración Logback homogénea. Cada línea identifica timestamp, servicio, nivel, hilo, logger y los valores MDC correlationId, requestId, collectionId y messageId disponibles. Los mensajes operativos y las excepciones que pueden llegar al log están redactados en inglés.</w:t>
+      </w:r>
+    </w:p>
+    <w:p>
+      <w:r>
+        <w:t>pollen-core acepta X-Correlation-Id o genera uno nuevo, lo devuelve en la respuesta y registra inicio, finalización, estado, resultado y duración de cada petición HTTP. El contexto de recolección continúa mediante requestId a través de la transacción inicial, el outbox, los workers y los heartbeats del lease.</w:t>
+      </w:r>
+    </w:p>
+    <w:p>
+      <w:r>
+        <w:t>Los listeners Rabbit de ambos servicios crean y limpian su contexto MDC en cada entrega. Se registran la recepción y procesamiento de solicitudes, mediciones y resultados, así como el indicador de redelivery. pollen-collector registra además consulta y duración de Open-Meteo, número de mediciones normalizadas y publicación de eventos finales. No se escriben credenciales ni cuerpos completos de respuestas externas.</w:t>
       </w:r>
     </w:p>
     <w:sectPr>

</xml_diff>